<commit_message>
fix(render): share one FontConfiguration per process to stop pango teardown segfault
WeasyPrint's default per-render FontConfiguration churns PangoFcFontMap
instances; GC finalization could destroy the map's HarfBuzz faces while a
later pass still walked them (SIGSEGV in hb_ot_face_t::fini), crashing
~30-50% of long publish runs on this host. A process-wide FONT_CONFIG
passed to write_pdf eliminates the racy teardown; stress-verified
(0 crashes in 720+ renders; 3x consecutive clean publish_all runs).

Also regenerates PUBLISHED/biol-1 with the updated Schedule (8/25
cancelled, sessions renumbered from 8/27, Lab 20 removed).
</commit_message>
<xml_diff>
--- a/course/Schedule.docx
+++ b/course/Schedule.docx
@@ -33,7 +33,9 @@
         <w:br/>
         <w:t>Required meetings are Tuesdays and Thursdays, 5:30–8:40 PM. The first class</w:t>
         <w:br/>
-        <w:t>meeting is August 25. The planned section final examination is December 10;</w:t>
+        <w:t>meeting is August 27 (the originally scheduled August 25 meeting is</w:t>
+        <w:br/>
+        <w:t>cancelled). The planned section final examination is December 10;</w:t>
         <w:br/>
         <w:t>December 15 is reserved for feedback and post-final discussions.</w:t>
       </w:r>
@@ -151,78 +153,6 @@
           </w:tcPr>
           <w:p>
             <w:r>
-              <w:t>Tue</w:t>
-            </w:r>
-          </w:p>
-        </w:tc>
-        <w:tc>
-          <w:tcPr>
-            <w:tcW w:type="dxa" w:w="1234"/>
-          </w:tcPr>
-          <w:p>
-            <w:r>
-              <w:t>8/25</w:t>
-            </w:r>
-          </w:p>
-        </w:tc>
-        <w:tc>
-          <w:tcPr>
-            <w:tcW w:type="dxa" w:w="1234"/>
-          </w:tcPr>
-          <w:p>
-            <w:r>
-              <w:t>Module 1: Biology - The Study of Life; Lab 1</w:t>
-            </w:r>
-          </w:p>
-        </w:tc>
-        <w:tc>
-          <w:tcPr>
-            <w:tcW w:type="dxa" w:w="1234"/>
-          </w:tcPr>
-          <w:p>
-            <w:r>
-              <w:t>Ch. 1</w:t>
-            </w:r>
-          </w:p>
-        </w:tc>
-        <w:tc>
-          <w:tcPr>
-            <w:tcW w:type="dxa" w:w="1234"/>
-          </w:tcPr>
-          <w:p>
-            <w:r>
-              <w:t>First class meeting</w:t>
-            </w:r>
-          </w:p>
-        </w:tc>
-      </w:tr>
-      <w:tr>
-        <w:tc>
-          <w:tcPr>
-            <w:tcW w:type="dxa" w:w="1234"/>
-          </w:tcPr>
-          <w:p>
-            <w:r>
-              <w:t>2</w:t>
-            </w:r>
-          </w:p>
-        </w:tc>
-        <w:tc>
-          <w:tcPr>
-            <w:tcW w:type="dxa" w:w="1234"/>
-          </w:tcPr>
-          <w:p>
-            <w:r>
-              <w:t>1</w:t>
-            </w:r>
-          </w:p>
-        </w:tc>
-        <w:tc>
-          <w:tcPr>
-            <w:tcW w:type="dxa" w:w="1234"/>
-          </w:tcPr>
-          <w:p>
-            <w:r>
               <w:t>Thu</w:t>
             </w:r>
           </w:p>
@@ -273,7 +203,7 @@
           </w:tcPr>
           <w:p>
             <w:r>
-              <w:t>3</w:t>
+              <w:t>2</w:t>
             </w:r>
           </w:p>
         </w:tc>
@@ -343,7 +273,7 @@
           </w:tcPr>
           <w:p>
             <w:r>
-              <w:t>4</w:t>
+              <w:t>3</w:t>
             </w:r>
           </w:p>
         </w:tc>
@@ -413,7 +343,7 @@
           </w:tcPr>
           <w:p>
             <w:r>
-              <w:t>5</w:t>
+              <w:t>4</w:t>
             </w:r>
           </w:p>
         </w:tc>
@@ -483,7 +413,7 @@
           </w:tcPr>
           <w:p>
             <w:r>
-              <w:t>6</w:t>
+              <w:t>5</w:t>
             </w:r>
           </w:p>
         </w:tc>
@@ -553,7 +483,7 @@
           </w:tcPr>
           <w:p>
             <w:r>
-              <w:t>7</w:t>
+              <w:t>6</w:t>
             </w:r>
           </w:p>
         </w:tc>
@@ -625,7 +555,7 @@
           </w:tcPr>
           <w:p>
             <w:r>
-              <w:t>8</w:t>
+              <w:t>7</w:t>
             </w:r>
           </w:p>
         </w:tc>
@@ -697,7 +627,7 @@
           </w:tcPr>
           <w:p>
             <w:r>
-              <w:t>9</w:t>
+              <w:t>8</w:t>
             </w:r>
           </w:p>
         </w:tc>
@@ -767,7 +697,7 @@
           </w:tcPr>
           <w:p>
             <w:r>
-              <w:t>10</w:t>
+              <w:t>9</w:t>
             </w:r>
           </w:p>
         </w:tc>
@@ -837,7 +767,7 @@
           </w:tcPr>
           <w:p>
             <w:r>
-              <w:t>11</w:t>
+              <w:t>10</w:t>
             </w:r>
           </w:p>
         </w:tc>
@@ -907,7 +837,7 @@
           </w:tcPr>
           <w:p>
             <w:r>
-              <w:t>12</w:t>
+              <w:t>11</w:t>
             </w:r>
           </w:p>
         </w:tc>
@@ -977,7 +907,7 @@
           </w:tcPr>
           <w:p>
             <w:r>
-              <w:t>13</w:t>
+              <w:t>12</w:t>
             </w:r>
           </w:p>
         </w:tc>
@@ -1047,7 +977,7 @@
           </w:tcPr>
           <w:p>
             <w:r>
-              <w:t>14</w:t>
+              <w:t>13</w:t>
             </w:r>
           </w:p>
         </w:tc>
@@ -1119,7 +1049,7 @@
           </w:tcPr>
           <w:p>
             <w:r>
-              <w:t>15</w:t>
+              <w:t>14</w:t>
             </w:r>
           </w:p>
         </w:tc>
@@ -1191,7 +1121,7 @@
           </w:tcPr>
           <w:p>
             <w:r>
-              <w:t>16</w:t>
+              <w:t>15</w:t>
             </w:r>
           </w:p>
         </w:tc>
@@ -1263,7 +1193,7 @@
           </w:tcPr>
           <w:p>
             <w:r>
-              <w:t>17</w:t>
+              <w:t>16</w:t>
             </w:r>
           </w:p>
         </w:tc>
@@ -1333,7 +1263,7 @@
           </w:tcPr>
           <w:p>
             <w:r>
-              <w:t>18</w:t>
+              <w:t>17</w:t>
             </w:r>
           </w:p>
         </w:tc>
@@ -1403,7 +1333,7 @@
           </w:tcPr>
           <w:p>
             <w:r>
-              <w:t>19</w:t>
+              <w:t>18</w:t>
             </w:r>
           </w:p>
         </w:tc>
@@ -1473,7 +1403,7 @@
           </w:tcPr>
           <w:p>
             <w:r>
-              <w:t>20</w:t>
+              <w:t>19</w:t>
             </w:r>
           </w:p>
         </w:tc>
@@ -1545,7 +1475,7 @@
           </w:tcPr>
           <w:p>
             <w:r>
-              <w:t>21</w:t>
+              <w:t>20</w:t>
             </w:r>
           </w:p>
         </w:tc>
@@ -1617,7 +1547,7 @@
           </w:tcPr>
           <w:p>
             <w:r>
-              <w:t>22</w:t>
+              <w:t>21</w:t>
             </w:r>
           </w:p>
         </w:tc>
@@ -1689,7 +1619,7 @@
           </w:tcPr>
           <w:p>
             <w:r>
-              <w:t>23</w:t>
+              <w:t>22</w:t>
             </w:r>
           </w:p>
         </w:tc>
@@ -1761,7 +1691,7 @@
           </w:tcPr>
           <w:p>
             <w:r>
-              <w:t>24</w:t>
+              <w:t>23</w:t>
             </w:r>
           </w:p>
         </w:tc>
@@ -1833,7 +1763,7 @@
           </w:tcPr>
           <w:p>
             <w:r>
-              <w:t>25</w:t>
+              <w:t>24</w:t>
             </w:r>
           </w:p>
         </w:tc>
@@ -1905,7 +1835,7 @@
           </w:tcPr>
           <w:p>
             <w:r>
-              <w:t>26</w:t>
+              <w:t>25</w:t>
             </w:r>
           </w:p>
         </w:tc>
@@ -1945,7 +1875,7 @@
           </w:tcPr>
           <w:p>
             <w:r>
-              <w:t>Lab 20 (TBD)</w:t>
+              <w:t>Review and make-up work</w:t>
             </w:r>
           </w:p>
         </w:tc>
@@ -1955,7 +1885,7 @@
           </w:tcPr>
           <w:p>
             <w:r>
-              <w:t>TBD; cumulative reference</w:t>
+              <w:t>Cumulative Chs. 1–17, 44–45</w:t>
             </w:r>
           </w:p>
         </w:tc>
@@ -1965,7 +1895,7 @@
           </w:tcPr>
           <w:p>
             <w:r>
-              <w:t>Topic and materials pending; see Lab 20 planning record</w:t>
+              <w:t>Open session for questions and make-up work</w:t>
             </w:r>
           </w:p>
         </w:tc>
@@ -1977,7 +1907,7 @@
           </w:tcPr>
           <w:p>
             <w:r>
-              <w:t>27</w:t>
+              <w:t>26</w:t>
             </w:r>
           </w:p>
         </w:tc>
@@ -2049,7 +1979,7 @@
           </w:tcPr>
           <w:p>
             <w:r>
-              <w:t>28</w:t>
+              <w:t>27</w:t>
             </w:r>
           </w:p>
         </w:tc>
@@ -2121,7 +2051,7 @@
           </w:tcPr>
           <w:p>
             <w:r>
-              <w:t>29</w:t>
+              <w:t>28</w:t>
             </w:r>
           </w:p>
         </w:tc>
@@ -2193,7 +2123,7 @@
           </w:tcPr>
           <w:p>
             <w:r>
-              <w:t>30</w:t>
+              <w:t>29</w:t>
             </w:r>
           </w:p>
         </w:tc>
@@ -2265,7 +2195,7 @@
           </w:tcPr>
           <w:p>
             <w:r>
-              <w:t>31</w:t>
+              <w:t>30</w:t>
             </w:r>
           </w:p>
         </w:tc>
@@ -2335,7 +2265,7 @@
           </w:tcPr>
           <w:p>
             <w:r>
-              <w:t>32</w:t>
+              <w:t>31</w:t>
             </w:r>
           </w:p>
         </w:tc>
@@ -2407,7 +2337,7 @@
           </w:tcPr>
           <w:p>
             <w:r>
-              <w:t>33</w:t>
+              <w:t>32</w:t>
             </w:r>
           </w:p>
         </w:tc>
@@ -2506,7 +2436,7 @@
         <w:t>First class meeting</w:t>
       </w:r>
       <w:r>
-        <w:t>: August 25, 2026</w:t>
+        <w:t>: August 27, 2026 (August 25 meeting cancelled)</w:t>
       </w:r>
     </w:p>
     <w:p>
@@ -2725,7 +2655,7 @@
         <w:t>Exam 01</w:t>
       </w:r>
       <w:r>
-        <w:t>: September 17, 2026 - Modules 1-6</w:t>
+        <w:t>: September 22, 2026 - Modules 1-6</w:t>
       </w:r>
     </w:p>
     <w:p>
@@ -2739,7 +2669,7 @@
         <w:t>Exam 02</w:t>
       </w:r>
       <w:r>
-        <w:t>: October 13, 2026 - Modules 7-11</w:t>
+        <w:t>: October 15, 2026 - Modules 7-11</w:t>
       </w:r>
     </w:p>
     <w:p>
@@ -2753,7 +2683,7 @@
         <w:t>Exam 03</w:t>
       </w:r>
       <w:r>
-        <w:t>: November 5, 2026 - Modules 12-16</w:t>
+        <w:t>: November 10, 2026 - Modules 12-16</w:t>
       </w:r>
     </w:p>
     <w:p>

</xml_diff>